<commit_message>
Quitar párrafos cortables del guion y de las notas del orador; ajustar tiempos
Co-Authored-By: Claude Opus 5.5 <noreply@anthropic.com>
Claude-Session: https://claude.ai/code/session_01FbQnxmXCWMLiXX8iQo1dcG
</commit_message>
<xml_diff>
--- a/Guion_y_repaso_Smith2022.docx
+++ b/Guion_y_repaso_Smith2022.docx
@@ -45,7 +45,7 @@
           <w:sz w:val="22"/>
           <w:szCs w:val="22"/>
         </w:rPr>
-        <w:t xml:space="preserve"> (aviso a los 4:00). Unas 720 palabras: a ritmo tranquilo (155 por minuto) son unos 4:40, y sin los párrafos grises, unos 4:10. Lo </w:t>
+        <w:t xml:space="preserve"> (aviso a los 4:00). Unas 640 palabras: a ritmo tranquilo (155 por minuto) son unos 4:10. Te quedan unos 50 segundos de margen: no hace falta correr. Lo </w:t>
       </w:r>
       <w:r>
         <w:rPr>
@@ -63,25 +63,7 @@
           <w:sz w:val="22"/>
           <w:szCs w:val="22"/>
         </w:rPr>
-        <w:t xml:space="preserve"> es para enfatizar; lo </w:t>
-      </w:r>
-      <w:r>
-        <w:rPr>
-          <w:rFonts w:ascii="Calibri" w:cs="Calibri" w:eastAsia="Calibri" w:hAnsi="Calibri"/>
-          <w:b/>
-          <w:bCs/>
-          <w:sz w:val="22"/>
-          <w:szCs w:val="22"/>
-        </w:rPr>
-        <w:t xml:space="preserve">gris</w:t>
-      </w:r>
-      <w:r>
-        <w:rPr>
-          <w:rFonts w:ascii="Calibri" w:cs="Calibri" w:eastAsia="Calibri" w:hAnsi="Calibri"/>
-          <w:sz w:val="22"/>
-          <w:szCs w:val="22"/>
-        </w:rPr>
-        <w:t xml:space="preserve"> se puede cortar si vas atrasado.</w:t>
+        <w:t xml:space="preserve"> es para enfatizar.</w:t>
       </w:r>
     </w:p>
     <w:p>
@@ -186,7 +168,7 @@
           <w:sz w:val="22"/>
           <w:szCs w:val="22"/>
         </w:rPr>
-        <w:t xml:space="preserve">   0:20 – 1:15</w:t>
+        <w:t xml:space="preserve">   0:20 – 1:05</w:t>
       </w:r>
     </w:p>
     <w:p>
@@ -241,20 +223,6 @@
           <w:szCs w:val="26"/>
         </w:rPr>
         <w:t xml:space="preserve">El caso es el Tata Memorial Hospital: concebido en 1932, abierto en 1941, y seguido hasta 1963. El método es archivo más entrevistas: los archivos Tata, el Instituto Tata de Investigación Fundamental, la British Library y Yale, y conversaciones con descendientes de los protagonistas.</w:t>
-      </w:r>
-    </w:p>
-    <w:p>
-      <w:pPr>
-        <w:spacing w:after="160" w:line="340"/>
-      </w:pPr>
-      <w:r>
-        <w:rPr>
-          <w:rFonts w:ascii="Calibri" w:cs="Calibri" w:eastAsia="Calibri" w:hAnsi="Calibri"/>
-          <w:color w:val="7A7A7A"/>
-          <w:sz w:val="26"/>
-          <w:szCs w:val="26"/>
-        </w:rPr>
-        <w:t xml:space="preserve">[Cortable] Abajo ven a Homi Bhabha presidiendo en Ginebra, en 1955, la conferencia Átomos para la Paz: el átomo y el cáncer se cruzan en la misma red.</w:t>
       </w:r>
     </w:p>
     <w:p>
@@ -305,7 +273,7 @@
           <w:sz w:val="22"/>
           <w:szCs w:val="22"/>
         </w:rPr>
-        <w:t xml:space="preserve">   1:15 – 2:40</w:t>
+        <w:t xml:space="preserve">   1:05 – 2:30</w:t>
       </w:r>
     </w:p>
     <w:p>
@@ -490,7 +458,7 @@
           <w:sz w:val="22"/>
           <w:szCs w:val="22"/>
         </w:rPr>
-        <w:t xml:space="preserve">   2:40 – 4:00</w:t>
+        <w:t xml:space="preserve">   2:30 – 3:40</w:t>
       </w:r>
     </w:p>
     <w:p>
@@ -514,20 +482,6 @@
           <w:szCs w:val="26"/>
         </w:rPr>
         <w:t xml:space="preserve">Estado, isótopos, hospital.</w:t>
-      </w:r>
-    </w:p>
-    <w:p>
-      <w:pPr>
-        <w:spacing w:after="160" w:line="340"/>
-      </w:pPr>
-      <w:r>
-        <w:rPr>
-          <w:rFonts w:ascii="Calibri" w:cs="Calibri" w:eastAsia="Calibri" w:hAnsi="Calibri"/>
-          <w:color w:val="7A7A7A"/>
-          <w:sz w:val="26"/>
-          <w:szCs w:val="26"/>
-        </w:rPr>
-        <w:t xml:space="preserve">[Cortable] Ya en 1947, el jefe de radiología, el doctor Mody, decía que la esperanza estaba en la «promesa» de los radioisótopos: ahí nace mi disciplina.</w:t>
       </w:r>
     </w:p>
     <w:p>
@@ -645,7 +599,7 @@
           <w:sz w:val="22"/>
           <w:szCs w:val="22"/>
         </w:rPr>
-        <w:t xml:space="preserve">   4:00 – 4:40</w:t>
+        <w:t xml:space="preserve">   3:40 – 4:10</w:t>
       </w:r>
     </w:p>
     <w:p>
@@ -677,20 +631,6 @@
           <w:szCs w:val="26"/>
         </w:rPr>
         <w:t xml:space="preserve"> Esta es la nota de FALP sobre nuestra visita a la CCHEN. Para Smith sería un documento de archivo: una alianza en formación, como la carta de Naidu a Bhabha en 1945. Para mí es el presente.</w:t>
-      </w:r>
-    </w:p>
-    <w:p>
-      <w:pPr>
-        <w:spacing w:after="160" w:line="340"/>
-      </w:pPr>
-      <w:r>
-        <w:rPr>
-          <w:rFonts w:ascii="Calibri" w:cs="Calibri" w:eastAsia="Calibri" w:hAnsi="Calibri"/>
-          <w:color w:val="7A7A7A"/>
-          <w:sz w:val="26"/>
-          <w:szCs w:val="26"/>
-        </w:rPr>
-        <w:t xml:space="preserve">[Cortable] Y fíjense en los botones de arriba: «Solicita tu hora», «Dona aquí». La filantropía y el mercado en la misma página.</w:t>
       </w:r>
     </w:p>
     <w:p>
@@ -798,9 +738,8 @@
         </w:tblBorders>
       </w:tblPr>
       <w:tblGrid>
-        <w:gridCol w:w="1500"/>
-        <w:gridCol w:w="4500"/>
-        <w:gridCol w:w="3000"/>
+        <w:gridCol w:w="2000"/>
+        <w:gridCol w:w="7000"/>
       </w:tblGrid>
       <w:tr>
         <w:trPr>
@@ -808,7 +747,7 @@
         </w:trPr>
         <w:tc>
           <w:tcPr>
-            <w:tcW w:type="dxa" w:w="1500"/>
+            <w:tcW w:type="dxa" w:w="2000"/>
             <w:tcBorders>
               <w:top w:val="single" w:color="BBBBBB" w:sz="4"/>
               <w:left w:val="single" w:color="BBBBBB" w:sz="4"/>
@@ -838,7 +777,7 @@
         </w:tc>
         <w:tc>
           <w:tcPr>
-            <w:tcW w:type="dxa" w:w="4500"/>
+            <w:tcW w:type="dxa" w:w="7000"/>
             <w:tcBorders>
               <w:top w:val="single" w:color="BBBBBB" w:sz="4"/>
               <w:left w:val="single" w:color="BBBBBB" w:sz="4"/>
@@ -866,16 +805,185 @@
             </w:r>
           </w:p>
         </w:tc>
-        <w:tc>
-          <w:tcPr>
-            <w:tcW w:type="dxa" w:w="3000"/>
-            <w:tcBorders>
-              <w:top w:val="single" w:color="BBBBBB" w:sz="4"/>
-              <w:left w:val="single" w:color="BBBBBB" w:sz="4"/>
-              <w:bottom w:val="single" w:color="BBBBBB" w:sz="4"/>
-              <w:right w:val="single" w:color="BBBBBB" w:sz="4"/>
-            </w:tcBorders>
-            <w:shd w:fill="E8EDF5" w:val="clear"/>
+      </w:tr>
+      <w:tr>
+        <w:tc>
+          <w:tcPr>
+            <w:tcW w:type="dxa" w:w="2000"/>
+            <w:tcBorders>
+              <w:top w:val="single" w:color="BBBBBB" w:sz="4"/>
+              <w:left w:val="single" w:color="BBBBBB" w:sz="4"/>
+              <w:bottom w:val="single" w:color="BBBBBB" w:sz="4"/>
+              <w:right w:val="single" w:color="BBBBBB" w:sz="4"/>
+            </w:tcBorders>
+            <w:tcMar>
+              <w:top w:type="dxa" w:w="60"/>
+              <w:left w:type="dxa" w:w="100"/>
+              <w:bottom w:type="dxa" w:w="60"/>
+              <w:right w:type="dxa" w:w="100"/>
+            </w:tcMar>
+          </w:tcPr>
+          <w:p>
+            <w:r>
+              <w:rPr>
+                <w:rFonts w:ascii="Calibri" w:cs="Calibri" w:eastAsia="Calibri" w:hAnsi="Calibri"/>
+                <w:sz w:val="20"/>
+                <w:szCs w:val="20"/>
+              </w:rPr>
+              <w:t xml:space="preserve">1:05</w:t>
+            </w:r>
+          </w:p>
+        </w:tc>
+        <w:tc>
+          <w:tcPr>
+            <w:tcW w:type="dxa" w:w="7000"/>
+            <w:tcBorders>
+              <w:top w:val="single" w:color="BBBBBB" w:sz="4"/>
+              <w:left w:val="single" w:color="BBBBBB" w:sz="4"/>
+              <w:bottom w:val="single" w:color="BBBBBB" w:sz="4"/>
+              <w:right w:val="single" w:color="BBBBBB" w:sz="4"/>
+            </w:tcBorders>
+            <w:tcMar>
+              <w:top w:type="dxa" w:w="60"/>
+              <w:left w:type="dxa" w:w="100"/>
+              <w:bottom w:type="dxa" w:w="60"/>
+              <w:right w:type="dxa" w:w="100"/>
+            </w:tcMar>
+          </w:tcPr>
+          <w:p>
+            <w:r>
+              <w:rPr>
+                <w:rFonts w:ascii="Calibri" w:cs="Calibri" w:eastAsia="Calibri" w:hAnsi="Calibri"/>
+                <w:sz w:val="20"/>
+                <w:szCs w:val="20"/>
+              </w:rPr>
+              <w:t xml:space="preserve">Empezando la diapositiva 3 («El argumento»)</w:t>
+            </w:r>
+          </w:p>
+        </w:tc>
+      </w:tr>
+      <w:tr>
+        <w:tc>
+          <w:tcPr>
+            <w:tcW w:type="dxa" w:w="2000"/>
+            <w:tcBorders>
+              <w:top w:val="single" w:color="BBBBBB" w:sz="4"/>
+              <w:left w:val="single" w:color="BBBBBB" w:sz="4"/>
+              <w:bottom w:val="single" w:color="BBBBBB" w:sz="4"/>
+              <w:right w:val="single" w:color="BBBBBB" w:sz="4"/>
+            </w:tcBorders>
+            <w:tcMar>
+              <w:top w:type="dxa" w:w="60"/>
+              <w:left w:type="dxa" w:w="100"/>
+              <w:bottom w:type="dxa" w:w="60"/>
+              <w:right w:type="dxa" w:w="100"/>
+            </w:tcMar>
+          </w:tcPr>
+          <w:p>
+            <w:r>
+              <w:rPr>
+                <w:rFonts w:ascii="Calibri" w:cs="Calibri" w:eastAsia="Calibri" w:hAnsi="Calibri"/>
+                <w:sz w:val="20"/>
+                <w:szCs w:val="20"/>
+              </w:rPr>
+              <w:t xml:space="preserve">2:30</w:t>
+            </w:r>
+          </w:p>
+        </w:tc>
+        <w:tc>
+          <w:tcPr>
+            <w:tcW w:type="dxa" w:w="7000"/>
+            <w:tcBorders>
+              <w:top w:val="single" w:color="BBBBBB" w:sz="4"/>
+              <w:left w:val="single" w:color="BBBBBB" w:sz="4"/>
+              <w:bottom w:val="single" w:color="BBBBBB" w:sz="4"/>
+              <w:right w:val="single" w:color="BBBBBB" w:sz="4"/>
+            </w:tcBorders>
+            <w:tcMar>
+              <w:top w:type="dxa" w:w="60"/>
+              <w:left w:type="dxa" w:w="100"/>
+              <w:bottom w:type="dxa" w:w="60"/>
+              <w:right w:type="dxa" w:w="100"/>
+            </w:tcMar>
+          </w:tcPr>
+          <w:p>
+            <w:r>
+              <w:rPr>
+                <w:rFonts w:ascii="Calibri" w:cs="Calibri" w:eastAsia="Calibri" w:hAnsi="Calibri"/>
+                <w:sz w:val="20"/>
+                <w:szCs w:val="20"/>
+              </w:rPr>
+              <w:t xml:space="preserve">Empezando la diapositiva 4 («Estado, isótopos, hospital»)</w:t>
+            </w:r>
+          </w:p>
+        </w:tc>
+      </w:tr>
+      <w:tr>
+        <w:tc>
+          <w:tcPr>
+            <w:tcW w:type="dxa" w:w="2000"/>
+            <w:tcBorders>
+              <w:top w:val="single" w:color="BBBBBB" w:sz="4"/>
+              <w:left w:val="single" w:color="BBBBBB" w:sz="4"/>
+              <w:bottom w:val="single" w:color="BBBBBB" w:sz="4"/>
+              <w:right w:val="single" w:color="BBBBBB" w:sz="4"/>
+            </w:tcBorders>
+            <w:tcMar>
+              <w:top w:type="dxa" w:w="60"/>
+              <w:left w:type="dxa" w:w="100"/>
+              <w:bottom w:type="dxa" w:w="60"/>
+              <w:right w:type="dxa" w:w="100"/>
+            </w:tcMar>
+          </w:tcPr>
+          <w:p>
+            <w:r>
+              <w:rPr>
+                <w:rFonts w:ascii="Calibri" w:cs="Calibri" w:eastAsia="Calibri" w:hAnsi="Calibri"/>
+                <w:sz w:val="20"/>
+                <w:szCs w:val="20"/>
+              </w:rPr>
+              <w:t xml:space="preserve">3:40</w:t>
+            </w:r>
+          </w:p>
+        </w:tc>
+        <w:tc>
+          <w:tcPr>
+            <w:tcW w:type="dxa" w:w="7000"/>
+            <w:tcBorders>
+              <w:top w:val="single" w:color="BBBBBB" w:sz="4"/>
+              <w:left w:val="single" w:color="BBBBBB" w:sz="4"/>
+              <w:bottom w:val="single" w:color="BBBBBB" w:sz="4"/>
+              <w:right w:val="single" w:color="BBBBBB" w:sz="4"/>
+            </w:tcBorders>
+            <w:tcMar>
+              <w:top w:type="dxa" w:w="60"/>
+              <w:left w:type="dxa" w:w="100"/>
+              <w:bottom w:type="dxa" w:w="60"/>
+              <w:right w:type="dxa" w:w="100"/>
+            </w:tcMar>
+          </w:tcPr>
+          <w:p>
+            <w:r>
+              <w:rPr>
+                <w:rFonts w:ascii="Calibri" w:cs="Calibri" w:eastAsia="Calibri" w:hAnsi="Calibri"/>
+                <w:sz w:val="20"/>
+                <w:szCs w:val="20"/>
+              </w:rPr>
+              <w:t xml:space="preserve">Empezando la diapositiva 5</w:t>
+            </w:r>
+          </w:p>
+        </w:tc>
+      </w:tr>
+      <w:tr>
+        <w:tc>
+          <w:tcPr>
+            <w:tcW w:type="dxa" w:w="2000"/>
+            <w:tcBorders>
+              <w:top w:val="single" w:color="BBBBBB" w:sz="4"/>
+              <w:left w:val="single" w:color="BBBBBB" w:sz="4"/>
+              <w:bottom w:val="single" w:color="BBBBBB" w:sz="4"/>
+              <w:right w:val="single" w:color="BBBBBB" w:sz="4"/>
+            </w:tcBorders>
             <w:tcMar>
               <w:top w:type="dxa" w:w="60"/>
               <w:left w:type="dxa" w:w="100"/>
@@ -892,341 +1000,34 @@
                 <w:sz w:val="20"/>
                 <w:szCs w:val="20"/>
               </w:rPr>
-              <w:t xml:space="preserve">Si vas atrasado</w:t>
-            </w:r>
-          </w:p>
-        </w:tc>
-      </w:tr>
-      <w:tr>
-        <w:tc>
-          <w:tcPr>
-            <w:tcW w:type="dxa" w:w="1500"/>
-            <w:tcBorders>
-              <w:top w:val="single" w:color="BBBBBB" w:sz="4"/>
-              <w:left w:val="single" w:color="BBBBBB" w:sz="4"/>
-              <w:bottom w:val="single" w:color="BBBBBB" w:sz="4"/>
-              <w:right w:val="single" w:color="BBBBBB" w:sz="4"/>
-            </w:tcBorders>
-            <w:tcMar>
-              <w:top w:type="dxa" w:w="60"/>
-              <w:left w:type="dxa" w:w="100"/>
-              <w:bottom w:type="dxa" w:w="60"/>
-              <w:right w:type="dxa" w:w="100"/>
-            </w:tcMar>
-          </w:tcPr>
-          <w:p>
-            <w:r>
-              <w:rPr>
-                <w:rFonts w:ascii="Calibri" w:cs="Calibri" w:eastAsia="Calibri" w:hAnsi="Calibri"/>
-                <w:sz w:val="20"/>
-                <w:szCs w:val="20"/>
-              </w:rPr>
-              <w:t xml:space="preserve">1:15</w:t>
-            </w:r>
-          </w:p>
-        </w:tc>
-        <w:tc>
-          <w:tcPr>
-            <w:tcW w:type="dxa" w:w="4500"/>
-            <w:tcBorders>
-              <w:top w:val="single" w:color="BBBBBB" w:sz="4"/>
-              <w:left w:val="single" w:color="BBBBBB" w:sz="4"/>
-              <w:bottom w:val="single" w:color="BBBBBB" w:sz="4"/>
-              <w:right w:val="single" w:color="BBBBBB" w:sz="4"/>
-            </w:tcBorders>
-            <w:tcMar>
-              <w:top w:type="dxa" w:w="60"/>
-              <w:left w:type="dxa" w:w="100"/>
-              <w:bottom w:type="dxa" w:w="60"/>
-              <w:right w:type="dxa" w:w="100"/>
-            </w:tcMar>
-          </w:tcPr>
-          <w:p>
-            <w:r>
-              <w:rPr>
-                <w:rFonts w:ascii="Calibri" w:cs="Calibri" w:eastAsia="Calibri" w:hAnsi="Calibri"/>
-                <w:sz w:val="20"/>
-                <w:szCs w:val="20"/>
-              </w:rPr>
-              <w:t xml:space="preserve">Empezando la diapositiva 3 («El argumento»)</w:t>
-            </w:r>
-          </w:p>
-        </w:tc>
-        <w:tc>
-          <w:tcPr>
-            <w:tcW w:type="dxa" w:w="3000"/>
-            <w:tcBorders>
-              <w:top w:val="single" w:color="BBBBBB" w:sz="4"/>
-              <w:left w:val="single" w:color="BBBBBB" w:sz="4"/>
-              <w:bottom w:val="single" w:color="BBBBBB" w:sz="4"/>
-              <w:right w:val="single" w:color="BBBBBB" w:sz="4"/>
-            </w:tcBorders>
-            <w:tcMar>
-              <w:top w:type="dxa" w:w="60"/>
-              <w:left w:type="dxa" w:w="100"/>
-              <w:bottom w:type="dxa" w:w="60"/>
-              <w:right w:type="dxa" w:w="100"/>
-            </w:tcMar>
-          </w:tcPr>
-          <w:p>
-            <w:r>
-              <w:rPr>
-                <w:rFonts w:ascii="Calibri" w:cs="Calibri" w:eastAsia="Calibri" w:hAnsi="Calibri"/>
-                <w:sz w:val="20"/>
-                <w:szCs w:val="20"/>
-              </w:rPr>
-              <w:t xml:space="preserve">Salta el párrafo de Bhabha en Ginebra</w:t>
-            </w:r>
-          </w:p>
-        </w:tc>
-      </w:tr>
-      <w:tr>
-        <w:tc>
-          <w:tcPr>
-            <w:tcW w:type="dxa" w:w="1500"/>
-            <w:tcBorders>
-              <w:top w:val="single" w:color="BBBBBB" w:sz="4"/>
-              <w:left w:val="single" w:color="BBBBBB" w:sz="4"/>
-              <w:bottom w:val="single" w:color="BBBBBB" w:sz="4"/>
-              <w:right w:val="single" w:color="BBBBBB" w:sz="4"/>
-            </w:tcBorders>
-            <w:tcMar>
-              <w:top w:type="dxa" w:w="60"/>
-              <w:left w:type="dxa" w:w="100"/>
-              <w:bottom w:type="dxa" w:w="60"/>
-              <w:right w:type="dxa" w:w="100"/>
-            </w:tcMar>
-          </w:tcPr>
-          <w:p>
-            <w:r>
-              <w:rPr>
-                <w:rFonts w:ascii="Calibri" w:cs="Calibri" w:eastAsia="Calibri" w:hAnsi="Calibri"/>
-                <w:sz w:val="20"/>
-                <w:szCs w:val="20"/>
-              </w:rPr>
-              <w:t xml:space="preserve">2:40</w:t>
-            </w:r>
-          </w:p>
-        </w:tc>
-        <w:tc>
-          <w:tcPr>
-            <w:tcW w:type="dxa" w:w="4500"/>
-            <w:tcBorders>
-              <w:top w:val="single" w:color="BBBBBB" w:sz="4"/>
-              <w:left w:val="single" w:color="BBBBBB" w:sz="4"/>
-              <w:bottom w:val="single" w:color="BBBBBB" w:sz="4"/>
-              <w:right w:val="single" w:color="BBBBBB" w:sz="4"/>
-            </w:tcBorders>
-            <w:tcMar>
-              <w:top w:type="dxa" w:w="60"/>
-              <w:left w:type="dxa" w:w="100"/>
-              <w:bottom w:type="dxa" w:w="60"/>
-              <w:right w:type="dxa" w:w="100"/>
-            </w:tcMar>
-          </w:tcPr>
-          <w:p>
-            <w:r>
-              <w:rPr>
-                <w:rFonts w:ascii="Calibri" w:cs="Calibri" w:eastAsia="Calibri" w:hAnsi="Calibri"/>
-                <w:sz w:val="20"/>
-                <w:szCs w:val="20"/>
-              </w:rPr>
-              <w:t xml:space="preserve">Empezando la diapositiva 4 («Estado, isótopos, hospital»)</w:t>
-            </w:r>
-          </w:p>
-        </w:tc>
-        <w:tc>
-          <w:tcPr>
-            <w:tcW w:type="dxa" w:w="3000"/>
-            <w:tcBorders>
-              <w:top w:val="single" w:color="BBBBBB" w:sz="4"/>
-              <w:left w:val="single" w:color="BBBBBB" w:sz="4"/>
-              <w:bottom w:val="single" w:color="BBBBBB" w:sz="4"/>
-              <w:right w:val="single" w:color="BBBBBB" w:sz="4"/>
-            </w:tcBorders>
-            <w:tcMar>
-              <w:top w:type="dxa" w:w="60"/>
-              <w:left w:type="dxa" w:w="100"/>
-              <w:bottom w:type="dxa" w:w="60"/>
-              <w:right w:type="dxa" w:w="100"/>
-            </w:tcMar>
-          </w:tcPr>
-          <w:p>
-            <w:r>
-              <w:rPr>
-                <w:rFonts w:ascii="Calibri" w:cs="Calibri" w:eastAsia="Calibri" w:hAnsi="Calibri"/>
-                <w:sz w:val="20"/>
-                <w:szCs w:val="20"/>
-              </w:rPr>
-              <w:t xml:space="preserve">Salta la frase de Mody</w:t>
-            </w:r>
-          </w:p>
-        </w:tc>
-      </w:tr>
-      <w:tr>
-        <w:tc>
-          <w:tcPr>
-            <w:tcW w:type="dxa" w:w="1500"/>
-            <w:tcBorders>
-              <w:top w:val="single" w:color="BBBBBB" w:sz="4"/>
-              <w:left w:val="single" w:color="BBBBBB" w:sz="4"/>
-              <w:bottom w:val="single" w:color="BBBBBB" w:sz="4"/>
-              <w:right w:val="single" w:color="BBBBBB" w:sz="4"/>
-            </w:tcBorders>
-            <w:tcMar>
-              <w:top w:type="dxa" w:w="60"/>
-              <w:left w:type="dxa" w:w="100"/>
-              <w:bottom w:type="dxa" w:w="60"/>
-              <w:right w:type="dxa" w:w="100"/>
-            </w:tcMar>
-          </w:tcPr>
-          <w:p>
-            <w:r>
-              <w:rPr>
-                <w:rFonts w:ascii="Calibri" w:cs="Calibri" w:eastAsia="Calibri" w:hAnsi="Calibri"/>
-                <w:b/>
-                <w:bCs/>
-                <w:sz w:val="20"/>
-                <w:szCs w:val="20"/>
-              </w:rPr>
               <w:t xml:space="preserve">4:00 (aviso)</w:t>
             </w:r>
           </w:p>
         </w:tc>
         <w:tc>
           <w:tcPr>
-            <w:tcW w:type="dxa" w:w="4500"/>
-            <w:tcBorders>
-              <w:top w:val="single" w:color="BBBBBB" w:sz="4"/>
-              <w:left w:val="single" w:color="BBBBBB" w:sz="4"/>
-              <w:bottom w:val="single" w:color="BBBBBB" w:sz="4"/>
-              <w:right w:val="single" w:color="BBBBBB" w:sz="4"/>
-            </w:tcBorders>
-            <w:tcMar>
-              <w:top w:type="dxa" w:w="60"/>
-              <w:left w:type="dxa" w:w="100"/>
-              <w:bottom w:type="dxa" w:w="60"/>
-              <w:right w:type="dxa" w:w="100"/>
-            </w:tcMar>
-          </w:tcPr>
-          <w:p>
-            <w:r>
-              <w:rPr>
-                <w:rFonts w:ascii="Calibri" w:cs="Calibri" w:eastAsia="Calibri" w:hAnsi="Calibri"/>
-                <w:sz w:val="20"/>
-                <w:szCs w:val="20"/>
-              </w:rPr>
-              <w:t xml:space="preserve">Cambiando a la diapositiva 5</w:t>
-            </w:r>
-          </w:p>
-        </w:tc>
-        <w:tc>
-          <w:tcPr>
-            <w:tcW w:type="dxa" w:w="3000"/>
-            <w:tcBorders>
-              <w:top w:val="single" w:color="BBBBBB" w:sz="4"/>
-              <w:left w:val="single" w:color="BBBBBB" w:sz="4"/>
-              <w:bottom w:val="single" w:color="BBBBBB" w:sz="4"/>
-              <w:right w:val="single" w:color="BBBBBB" w:sz="4"/>
-            </w:tcBorders>
-            <w:tcMar>
-              <w:top w:type="dxa" w:w="60"/>
-              <w:left w:type="dxa" w:w="100"/>
-              <w:bottom w:type="dxa" w:w="60"/>
-              <w:right w:type="dxa" w:w="100"/>
-            </w:tcMar>
-          </w:tcPr>
-          <w:p>
-            <w:r>
-              <w:rPr>
-                <w:rFonts w:ascii="Calibri" w:cs="Calibri" w:eastAsia="Calibri" w:hAnsi="Calibri"/>
-                <w:sz w:val="20"/>
-                <w:szCs w:val="20"/>
-              </w:rPr>
-              <w:t xml:space="preserve">Si aún estás en la 4, cierra con «yo miro desde la entrega diaria» y pasa a la 5</w:t>
-            </w:r>
-          </w:p>
-        </w:tc>
-      </w:tr>
-      <w:tr>
-        <w:tc>
-          <w:tcPr>
-            <w:tcW w:type="dxa" w:w="1500"/>
-            <w:tcBorders>
-              <w:top w:val="single" w:color="BBBBBB" w:sz="4"/>
-              <w:left w:val="single" w:color="BBBBBB" w:sz="4"/>
-              <w:bottom w:val="single" w:color="BBBBBB" w:sz="4"/>
-              <w:right w:val="single" w:color="BBBBBB" w:sz="4"/>
-            </w:tcBorders>
-            <w:tcMar>
-              <w:top w:type="dxa" w:w="60"/>
-              <w:left w:type="dxa" w:w="100"/>
-              <w:bottom w:type="dxa" w:w="60"/>
-              <w:right w:type="dxa" w:w="100"/>
-            </w:tcMar>
-          </w:tcPr>
-          <w:p>
-            <w:r>
-              <w:rPr>
-                <w:rFonts w:ascii="Calibri" w:cs="Calibri" w:eastAsia="Calibri" w:hAnsi="Calibri"/>
-                <w:sz w:val="20"/>
-                <w:szCs w:val="20"/>
-              </w:rPr>
-              <w:t xml:space="preserve">4:40</w:t>
-            </w:r>
-          </w:p>
-        </w:tc>
-        <w:tc>
-          <w:tcPr>
-            <w:tcW w:type="dxa" w:w="4500"/>
-            <w:tcBorders>
-              <w:top w:val="single" w:color="BBBBBB" w:sz="4"/>
-              <w:left w:val="single" w:color="BBBBBB" w:sz="4"/>
-              <w:bottom w:val="single" w:color="BBBBBB" w:sz="4"/>
-              <w:right w:val="single" w:color="BBBBBB" w:sz="4"/>
-            </w:tcBorders>
-            <w:tcMar>
-              <w:top w:type="dxa" w:w="60"/>
-              <w:left w:type="dxa" w:w="100"/>
-              <w:bottom w:type="dxa" w:w="60"/>
-              <w:right w:type="dxa" w:w="100"/>
-            </w:tcMar>
-          </w:tcPr>
-          <w:p>
-            <w:r>
-              <w:rPr>
-                <w:rFonts w:ascii="Calibri" w:cs="Calibri" w:eastAsia="Calibri" w:hAnsi="Calibri"/>
-                <w:sz w:val="20"/>
-                <w:szCs w:val="20"/>
-              </w:rPr>
-              <w:t xml:space="preserve">«Gracias»</w:t>
-            </w:r>
-          </w:p>
-        </w:tc>
-        <w:tc>
-          <w:tcPr>
-            <w:tcW w:type="dxa" w:w="3000"/>
-            <w:tcBorders>
-              <w:top w:val="single" w:color="BBBBBB" w:sz="4"/>
-              <w:left w:val="single" w:color="BBBBBB" w:sz="4"/>
-              <w:bottom w:val="single" w:color="BBBBBB" w:sz="4"/>
-              <w:right w:val="single" w:color="BBBBBB" w:sz="4"/>
-            </w:tcBorders>
-            <w:tcMar>
-              <w:top w:type="dxa" w:w="60"/>
-              <w:left w:type="dxa" w:w="100"/>
-              <w:bottom w:type="dxa" w:w="60"/>
-              <w:right w:type="dxa" w:w="100"/>
-            </w:tcMar>
-          </w:tcPr>
-          <w:p>
-            <w:r>
-              <w:rPr>
-                <w:rFonts w:ascii="Calibri" w:cs="Calibri" w:eastAsia="Calibri" w:hAnsi="Calibri"/>
-                <w:sz w:val="20"/>
-                <w:szCs w:val="20"/>
-              </w:rPr>
-              <w:t xml:space="preserve">Salta los botones; deja solo la pregunta final</w:t>
+            <w:tcW w:type="dxa" w:w="7000"/>
+            <w:tcBorders>
+              <w:top w:val="single" w:color="BBBBBB" w:sz="4"/>
+              <w:left w:val="single" w:color="BBBBBB" w:sz="4"/>
+              <w:bottom w:val="single" w:color="BBBBBB" w:sz="4"/>
+              <w:right w:val="single" w:color="BBBBBB" w:sz="4"/>
+            </w:tcBorders>
+            <w:tcMar>
+              <w:top w:type="dxa" w:w="60"/>
+              <w:left w:type="dxa" w:w="100"/>
+              <w:bottom w:type="dxa" w:w="60"/>
+              <w:right w:type="dxa" w:w="100"/>
+            </w:tcMar>
+          </w:tcPr>
+          <w:p>
+            <w:r>
+              <w:rPr>
+                <w:rFonts w:ascii="Calibri" w:cs="Calibri" w:eastAsia="Calibri" w:hAnsi="Calibri"/>
+                <w:sz w:val="20"/>
+                <w:szCs w:val="20"/>
+              </w:rPr>
+              <w:t xml:space="preserve">Diciendo la pregunta final</w:t>
             </w:r>
           </w:p>
         </w:tc>
@@ -1240,7 +1041,7 @@
         <w:rPr>
           <w:rFonts w:ascii="Calibri" w:cs="Calibri" w:eastAsia="Calibri" w:hAnsi="Calibri"/>
         </w:rPr>
-        <w:t xml:space="preserve">Los párrafos en gris del guion son cortables: suman unos 30 segundos. La pregunta final no se corta nunca.</w:t>
+        <w:t xml:space="preserve">Si al aviso de los 4:00 todavía estás en la diapositiva 4, cierra con «yo miro desde la entrega diaria» y pasa directo a la pregunta final.</w:t>
       </w:r>
     </w:p>
     <w:p>

</xml_diff>